<commit_message>
SQL evidence: split the 4 widest results into left and right halves so they can be read
Query 1, Query 5, the Recommendations check and integrity test 2 were too wide
to read on GitHub. Word and PDF copies rebuilt with the new pictures.

Co-Authored-By: Claude Opus 5.5 <noreply@anthropic.com>
</commit_message>
<xml_diff>
--- a/01_Computing_Fundamentals/01_Contributions/Marcus_SQL/SQL_Query_Evidence.docx
+++ b/01_Computing_Fundamentals/01_Contributions/Marcus_SQL/SQL_Query_Evidence.docx
@@ -140,7 +140,7 @@
       <w:r>
         <w:drawing>
           <wp:inline>
-            <wp:extent cx="9180000" cy="1544914"/>
+            <wp:extent cx="6300000" cy="3552060"/>
             <wp:effectExtent b="0" l="0" r="0" t="0"/>
             <wp:docPr descr="Query 1 result" title="" id="10" name="Picture"/>
             <a:graphic>
@@ -161,7 +161,7 @@
                   <pic:spPr bwMode="auto">
                     <a:xfrm>
                       <a:off x="0" y="0"/>
-                      <a:ext cx="9180000" cy="1544914"/>
+                      <a:ext cx="6300000" cy="3552060"/>
                     </a:xfrm>
                     <a:prstGeom prst="rect">
                       <a:avLst/>
@@ -189,12 +189,9 @@
       </w:r>
     </w:p>
     <w:p>
-      <w:pPr>
-        <w:sectPr>
-          <w:pgSz w:w="16838" w:h="11906" w:orient="landscape"/>
-          <w:pgMar w:top="1134" w:right="1134" w:bottom="1134" w:left="1134" w:header="708" w:footer="708" w:gutter="0"/>
-        </w:sectPr>
-      </w:pPr>
+      <w:r>
+        <w:br w:type="page"/>
+      </w:r>
     </w:p>
     <w:bookmarkEnd w:id="12"/>
     <w:bookmarkStart w:id="16" w:name="query-2-just-the-names-and-budgets"/>
@@ -250,7 +247,7 @@
       <w:r>
         <w:drawing>
           <wp:inline>
-            <wp:extent cx="6300000" cy="2436791"/>
+            <wp:extent cx="6300000" cy="2392216"/>
             <wp:effectExtent b="0" l="0" r="0" t="0"/>
             <wp:docPr descr="Query 2 result" title="" id="14" name="Picture"/>
             <a:graphic>
@@ -271,7 +268,7 @@
                   <pic:spPr bwMode="auto">
                     <a:xfrm>
                       <a:off x="0" y="0"/>
-                      <a:ext cx="6300000" cy="2436791"/>
+                      <a:ext cx="6300000" cy="2392216"/>
                     </a:xfrm>
                     <a:prstGeom prst="rect">
                       <a:avLst/>
@@ -402,7 +399,7 @@
       <w:r>
         <w:drawing>
           <wp:inline>
-            <wp:extent cx="6300000" cy="2280777"/>
+            <wp:extent cx="6300000" cy="2236202"/>
             <wp:effectExtent b="0" l="0" r="0" t="0"/>
             <wp:docPr descr="Query 3 result" title="" id="18" name="Picture"/>
             <a:graphic>
@@ -423,7 +420,7 @@
                   <pic:spPr bwMode="auto">
                     <a:xfrm>
                       <a:off x="0" y="0"/>
-                      <a:ext cx="6300000" cy="2280777"/>
+                      <a:ext cx="6300000" cy="2236202"/>
                     </a:xfrm>
                     <a:prstGeom prst="rect">
                       <a:avLst/>
@@ -554,7 +551,7 @@
       <w:r>
         <w:drawing>
           <wp:inline>
-            <wp:extent cx="6300000" cy="2436791"/>
+            <wp:extent cx="6300000" cy="2392216"/>
             <wp:effectExtent b="0" l="0" r="0" t="0"/>
             <wp:docPr descr="Query 4 result" title="" id="22" name="Picture"/>
             <a:graphic>
@@ -575,7 +572,7 @@
                   <pic:spPr bwMode="auto">
                     <a:xfrm>
                       <a:off x="0" y="0"/>
-                      <a:ext cx="6300000" cy="2436791"/>
+                      <a:ext cx="6300000" cy="2392216"/>
                     </a:xfrm>
                     <a:prstGeom prst="rect">
                       <a:avLst/>
@@ -603,12 +600,9 @@
       </w:r>
     </w:p>
     <w:p>
-      <w:pPr>
-        <w:sectPr>
-          <w:pgSz w:w="11906" w:h="16838"/>
-          <w:pgMar w:top="1134" w:right="1134" w:bottom="1134" w:left="1134" w:header="708" w:footer="708" w:gutter="0"/>
-        </w:sectPr>
-      </w:pPr>
+      <w:r>
+        <w:br w:type="page"/>
+      </w:r>
     </w:p>
     <w:bookmarkEnd w:id="24"/>
     <w:bookmarkStart w:id="28" w:name="query-5-find-one-builds-items"/>
@@ -712,7 +706,7 @@
       <w:r>
         <w:drawing>
           <wp:inline>
-            <wp:extent cx="9180000" cy="3031769"/>
+            <wp:extent cx="4984163" cy="5760000"/>
             <wp:effectExtent b="0" l="0" r="0" t="0"/>
             <wp:docPr descr="Query 5 result" title="" id="26" name="Picture"/>
             <a:graphic>
@@ -733,7 +727,7 @@
                   <pic:spPr bwMode="auto">
                     <a:xfrm>
                       <a:off x="0" y="0"/>
-                      <a:ext cx="9180000" cy="3031769"/>
+                      <a:ext cx="4984163" cy="5760000"/>
                     </a:xfrm>
                     <a:prstGeom prst="rect">
                       <a:avLst/>
@@ -761,12 +755,9 @@
       </w:r>
     </w:p>
     <w:p>
-      <w:pPr>
-        <w:sectPr>
-          <w:pgSz w:w="16838" w:h="11906" w:orient="landscape"/>
-          <w:pgMar w:top="1134" w:right="1134" w:bottom="1134" w:left="1134" w:header="708" w:footer="708" w:gutter="0"/>
-        </w:sectPr>
-      </w:pPr>
+      <w:r>
+        <w:br w:type="page"/>
+      </w:r>
     </w:p>
     <w:bookmarkEnd w:id="28"/>
     <w:bookmarkStart w:id="32" w:name="query-6-count-the-items-in-a-build"/>
@@ -918,7 +909,7 @@
       <w:r>
         <w:drawing>
           <wp:inline>
-            <wp:extent cx="6300000" cy="1968750"/>
+            <wp:extent cx="6300000" cy="1924174"/>
             <wp:effectExtent b="0" l="0" r="0" t="0"/>
             <wp:docPr descr="Query 6 result" title="" id="30" name="Picture"/>
             <a:graphic>
@@ -939,7 +930,7 @@
                   <pic:spPr bwMode="auto">
                     <a:xfrm>
                       <a:off x="0" y="0"/>
-                      <a:ext cx="6300000" cy="1968750"/>
+                      <a:ext cx="6300000" cy="1924174"/>
                     </a:xfrm>
                     <a:prstGeom prst="rect">
                       <a:avLst/>
@@ -1116,7 +1107,7 @@
       <w:r>
         <w:drawing>
           <wp:inline>
-            <wp:extent cx="6300000" cy="1968750"/>
+            <wp:extent cx="6300000" cy="1924174"/>
             <wp:effectExtent b="0" l="0" r="0" t="0"/>
             <wp:docPr descr="Query 7 result" title="" id="35" name="Picture"/>
             <a:graphic>
@@ -1137,7 +1128,7 @@
                   <pic:spPr bwMode="auto">
                     <a:xfrm>
                       <a:off x="0" y="0"/>
-                      <a:ext cx="6300000" cy="1968750"/>
+                      <a:ext cx="6300000" cy="1924174"/>
                     </a:xfrm>
                     <a:prstGeom prst="rect">
                       <a:avLst/>
@@ -1343,7 +1334,7 @@
       <w:r>
         <w:drawing>
           <wp:inline>
-            <wp:extent cx="6300000" cy="1968750"/>
+            <wp:extent cx="6300000" cy="1924174"/>
             <wp:effectExtent b="0" l="0" r="0" t="0"/>
             <wp:docPr descr="Query 8 result" title="" id="39" name="Picture"/>
             <a:graphic>
@@ -1364,7 +1355,7 @@
                   <pic:spPr bwMode="auto">
                     <a:xfrm>
                       <a:off x="0" y="0"/>
-                      <a:ext cx="6300000" cy="1968750"/>
+                      <a:ext cx="6300000" cy="1924174"/>
                     </a:xfrm>
                     <a:prstGeom prst="rect">
                       <a:avLst/>
@@ -1547,7 +1538,7 @@
       <w:r>
         <w:drawing>
           <wp:inline>
-            <wp:extent cx="6300000" cy="2719103"/>
+            <wp:extent cx="6300000" cy="2674527"/>
             <wp:effectExtent b="0" l="0" r="0" t="0"/>
             <wp:docPr descr="Query 9 result" title="" id="44" name="Picture"/>
             <a:graphic>
@@ -1568,7 +1559,7 @@
                   <pic:spPr bwMode="auto">
                     <a:xfrm>
                       <a:off x="0" y="0"/>
-                      <a:ext cx="6300000" cy="2719103"/>
+                      <a:ext cx="6300000" cy="2674527"/>
                     </a:xfrm>
                     <a:prstGeom prst="rect">
                       <a:avLst/>
@@ -1735,7 +1726,7 @@
       <w:r>
         <w:drawing>
           <wp:inline>
-            <wp:extent cx="6300000" cy="4420400"/>
+            <wp:extent cx="6300000" cy="4375824"/>
             <wp:effectExtent b="0" l="0" r="0" t="0"/>
             <wp:docPr descr="Query 10 result" title="" id="48" name="Picture"/>
             <a:graphic>
@@ -1756,7 +1747,7 @@
                   <pic:spPr bwMode="auto">
                     <a:xfrm>
                       <a:off x="0" y="0"/>
-                      <a:ext cx="6300000" cy="4420400"/>
+                      <a:ext cx="6300000" cy="4375824"/>
                     </a:xfrm>
                     <a:prstGeom prst="rect">
                       <a:avLst/>
@@ -1986,7 +1977,7 @@
       <w:r>
         <w:drawing>
           <wp:inline>
-            <wp:extent cx="6300000" cy="2525943"/>
+            <wp:extent cx="6300000" cy="2481367"/>
             <wp:effectExtent b="0" l="0" r="0" t="0"/>
             <wp:docPr descr="Query 11 result" title="" id="52" name="Picture"/>
             <a:graphic>
@@ -2007,7 +1998,7 @@
                   <pic:spPr bwMode="auto">
                     <a:xfrm>
                       <a:off x="0" y="0"/>
-                      <a:ext cx="6300000" cy="2525943"/>
+                      <a:ext cx="6300000" cy="2481367"/>
                     </a:xfrm>
                     <a:prstGeom prst="rect">
                       <a:avLst/>
@@ -2346,7 +2337,7 @@
       <w:r>
         <w:drawing>
           <wp:inline>
-            <wp:extent cx="6300000" cy="3097994"/>
+            <wp:extent cx="6300000" cy="3053418"/>
             <wp:effectExtent b="0" l="0" r="0" t="0"/>
             <wp:docPr descr="Role totals result" title="" id="57" name="Picture"/>
             <a:graphic>
@@ -2367,7 +2358,7 @@
                   <pic:spPr bwMode="auto">
                     <a:xfrm>
                       <a:off x="0" y="0"/>
-                      <a:ext cx="6300000" cy="3097994"/>
+                      <a:ext cx="6300000" cy="3053418"/>
                     </a:xfrm>
                     <a:prstGeom prst="rect">
                       <a:avLst/>
@@ -2465,7 +2456,7 @@
       <w:r>
         <w:drawing>
           <wp:inline>
-            <wp:extent cx="6300000" cy="2429362"/>
+            <wp:extent cx="6300000" cy="2384787"/>
             <wp:effectExtent b="0" l="0" r="0" t="0"/>
             <wp:docPr descr="WorkstationBuilds" title="" id="61" name="Picture"/>
             <a:graphic>
@@ -2486,7 +2477,7 @@
                   <pic:spPr bwMode="auto">
                     <a:xfrm>
                       <a:off x="0" y="0"/>
-                      <a:ext cx="6300000" cy="2429362"/>
+                      <a:ext cx="6300000" cy="2384787"/>
                     </a:xfrm>
                     <a:prstGeom prst="rect">
                       <a:avLst/>
@@ -2514,12 +2505,9 @@
       </w:r>
     </w:p>
     <w:p>
-      <w:pPr>
-        <w:sectPr>
-          <w:pgSz w:w="11906" w:h="16838"/>
-          <w:pgMar w:top="1134" w:right="1134" w:bottom="1134" w:left="1134" w:header="708" w:footer="708" w:gutter="0"/>
-        </w:sectPr>
-      </w:pPr>
+      <w:r>
+        <w:br w:type="page"/>
+      </w:r>
     </w:p>
     <w:p>
       <w:pPr>
@@ -2577,7 +2565,7 @@
       <w:r>
         <w:drawing>
           <wp:inline>
-            <wp:extent cx="9180000" cy="3434727"/>
+            <wp:extent cx="4249870" cy="5760000"/>
             <wp:effectExtent b="0" l="0" r="0" t="0"/>
             <wp:docPr descr="Recommendations" title="" id="64" name="Picture"/>
             <a:graphic>
@@ -2598,7 +2586,7 @@
                   <pic:spPr bwMode="auto">
                     <a:xfrm>
                       <a:off x="0" y="0"/>
-                      <a:ext cx="9180000" cy="3434727"/>
+                      <a:ext cx="4249870" cy="5760000"/>
                     </a:xfrm>
                     <a:prstGeom prst="rect">
                       <a:avLst/>
@@ -2626,12 +2614,9 @@
       </w:r>
     </w:p>
     <w:p>
-      <w:pPr>
-        <w:sectPr>
-          <w:pgSz w:w="16838" w:h="11906" w:orient="landscape"/>
-          <w:pgMar w:top="1134" w:right="1134" w:bottom="1134" w:left="1134" w:header="708" w:footer="708" w:gutter="0"/>
-        </w:sectPr>
-      </w:pPr>
+      <w:r>
+        <w:br w:type="page"/>
+      </w:r>
     </w:p>
     <w:bookmarkEnd w:id="66"/>
     <w:bookmarkStart w:id="79" w:name="X2e49a2ea7f507e4284151a128135bd5ac6f8b41"/>
@@ -2845,7 +2830,7 @@
       <w:r>
         <w:drawing>
           <wp:inline>
-            <wp:extent cx="6300000" cy="1753301"/>
+            <wp:extent cx="6300000" cy="1708725"/>
             <wp:effectExtent b="0" l="0" r="0" t="0"/>
             <wp:docPr descr="Integrity test 1" title="" id="68" name="Picture"/>
             <a:graphic>
@@ -2866,7 +2851,7 @@
                   <pic:spPr bwMode="auto">
                     <a:xfrm>
                       <a:off x="0" y="0"/>
-                      <a:ext cx="6300000" cy="1753301"/>
+                      <a:ext cx="6300000" cy="1708725"/>
                     </a:xfrm>
                     <a:prstGeom prst="rect">
                       <a:avLst/>
@@ -2894,12 +2879,9 @@
       </w:r>
     </w:p>
     <w:p>
-      <w:pPr>
-        <w:sectPr>
-          <w:pgSz w:w="11906" w:h="16838"/>
-          <w:pgMar w:top="1134" w:right="1134" w:bottom="1134" w:left="1134" w:header="708" w:footer="708" w:gutter="0"/>
-        </w:sectPr>
-      </w:pPr>
+      <w:r>
+        <w:br w:type="page"/>
+      </w:r>
     </w:p>
     <w:p>
       <w:pPr>
@@ -3098,7 +3080,7 @@
       <w:r>
         <w:drawing>
           <wp:inline>
-            <wp:extent cx="9180000" cy="1228858"/>
+            <wp:extent cx="6300000" cy="2500443"/>
             <wp:effectExtent b="0" l="0" r="0" t="0"/>
             <wp:docPr descr="Integrity test 2" title="" id="71" name="Picture"/>
             <a:graphic>
@@ -3119,7 +3101,7 @@
                   <pic:spPr bwMode="auto">
                     <a:xfrm>
                       <a:off x="0" y="0"/>
-                      <a:ext cx="9180000" cy="1228858"/>
+                      <a:ext cx="6300000" cy="2500443"/>
                     </a:xfrm>
                     <a:prstGeom prst="rect">
                       <a:avLst/>
@@ -3147,12 +3129,9 @@
       </w:r>
     </w:p>
     <w:p>
-      <w:pPr>
-        <w:sectPr>
-          <w:pgSz w:w="16838" w:h="11906" w:orient="landscape"/>
-          <w:pgMar w:top="1134" w:right="1134" w:bottom="1134" w:left="1134" w:header="708" w:footer="708" w:gutter="0"/>
-        </w:sectPr>
-      </w:pPr>
+      <w:r>
+        <w:br w:type="page"/>
+      </w:r>
     </w:p>
     <w:p>
       <w:pPr>
@@ -3348,7 +3327,7 @@
       <w:r>
         <w:drawing>
           <wp:inline>
-            <wp:extent cx="6300000" cy="1753301"/>
+            <wp:extent cx="6300000" cy="1708725"/>
             <wp:effectExtent b="0" l="0" r="0" t="0"/>
             <wp:docPr descr="Integrity test 3" title="" id="74" name="Picture"/>
             <a:graphic>
@@ -3369,7 +3348,7 @@
                   <pic:spPr bwMode="auto">
                     <a:xfrm>
                       <a:off x="0" y="0"/>
-                      <a:ext cx="6300000" cy="1753301"/>
+                      <a:ext cx="6300000" cy="1708725"/>
                     </a:xfrm>
                     <a:prstGeom prst="rect">
                       <a:avLst/>
@@ -3610,7 +3589,7 @@
       <w:r>
         <w:drawing>
           <wp:inline>
-            <wp:extent cx="6300000" cy="1753301"/>
+            <wp:extent cx="6300000" cy="1708725"/>
             <wp:effectExtent b="0" l="0" r="0" t="0"/>
             <wp:docPr descr="Integrity test 4" title="" id="77" name="Picture"/>
             <a:graphic>
@@ -3631,7 +3610,7 @@
                   <pic:spPr bwMode="auto">
                     <a:xfrm>
                       <a:off x="0" y="0"/>
-                      <a:ext cx="6300000" cy="1753301"/>
+                      <a:ext cx="6300000" cy="1708725"/>
                     </a:xfrm>
                     <a:prstGeom prst="rect">
                       <a:avLst/>

</xml_diff>